<commit_message>
ACP 0900193-90: v3 — procuração revisada (CPC 104 §2º, atos extraprocessuais, sede JUCESC, grafia do nome, poderes ampliados) e ajustes na peça principal
Co-Authored-By: Claude Fable 5.1 <noreply@anthropic.com>
Claude-Session: https://claude.ai/code/session_01CCVbA1mc4UdnaFNsukuTYT
</commit_message>
<xml_diff>
--- a/juridico/ACP-0900193-90.2016.8.24.0064/2026-09-02-cumprimento-ev25/auditoria/CHECKLIST-PROTOCOLO.docx
+++ b/juridico/ACP-0900193-90.2016.8.24.0064/2026-09-02-cumprimento-ev25/auditoria/CHECKLIST-PROTOCOLO.docx
@@ -214,7 +214,26 @@
           <w:sz w:val="24"/>
           <w:szCs w:val="24"/>
         </w:rPr>
-        <w:t xml:space="preserve">Sétima Alteração do Contrato Social (Doc. 3) — PDF completo, com o registro na JUCESC (08/06/2021).</w:t>
+        <w:t xml:space="preserve">Sétima Alteração do Contrato Social (Doc. 3) — PDF completo, com o registro na JUCESC (08/06/2021). Conferir a redação literal da Cláusula Quinta: se ela mencionar expressamente a constituição de procuradores, pode-se restabelecer a referência direta na procuração; se for silente, a redação atual (poder de constituir mandatários "nos limites dessa atribuição", CC art. 1.018) já cobre.</w:t>
+      </w:r>
+    </w:p>
+    <w:p>
+      <w:pPr>
+        <w:pStyle w:val="ListParagraph"/>
+        <w:numPr>
+          <w:ilvl w:val="0"/>
+          <w:numId w:val="2"/>
+        </w:numPr>
+        <w:spacing w:after="80" w:line="360"/>
+        <w:jc w:val="both"/>
+      </w:pPr>
+      <w:r>
+        <w:rPr>
+          <w:rFonts w:ascii="Times New Roman" w:cs="Times New Roman" w:eastAsia="Times New Roman" w:hAnsi="Times New Roman"/>
+          <w:sz w:val="24"/>
+          <w:szCs w:val="24"/>
+        </w:rPr>
+        <w:t xml:space="preserve">Grafia do nome: contrato social e CPF grafam "Fabrizio"; a OAB, "Fabrízio". A procuração registra as duas e informa a identidade; conferir a grafia do RG.</w:t>
       </w:r>
     </w:p>
     <w:p>

</xml_diff>

<commit_message>
ACP 0900193-90: checklist e relatório — coerência de datas entre as peças e remoção das marcações de conferência
Co-Authored-By: Claude Fable 5.1 <noreply@anthropic.com>
Claude-Session: https://claude.ai/code/session_01CCVbA1mc4UdnaFNsukuTYT
</commit_message>
<xml_diff>
--- a/juridico/ACP-0900193-90.2016.8.24.0064/2026-09-02-cumprimento-ev25/auditoria/CHECKLIST-PROTOCOLO.docx
+++ b/juridico/ACP-0900193-90.2016.8.24.0064/2026-09-02-cumprimento-ev25/auditoria/CHECKLIST-PROTOCOLO.docx
@@ -271,7 +271,26 @@
           <w:sz w:val="24"/>
           <w:szCs w:val="24"/>
         </w:rPr>
-        <w:t xml:space="preserve">Peça principal em PDF, revisada, com a data certa (a data do protocolo) e a afirmação de pagamento coerente com o comprovante.</w:t>
+        <w:t xml:space="preserve">Peça principal em PDF, revisada, com a data certa (a data do protocolo) e a afirmação de pagamento coerente com o comprovante. As três peças e a procuração estão datadas de 02/09/2026 e a peça 03 diz que a principal foi "protocolada nesta data": se o protocolo ficar para 03/09, redatar as três em conjunto (buscar "2 de setembro de 2026" nos .md e regenerar).</w:t>
+      </w:r>
+    </w:p>
+    <w:p>
+      <w:pPr>
+        <w:pStyle w:val="ListParagraph"/>
+        <w:numPr>
+          <w:ilvl w:val="0"/>
+          <w:numId w:val="2"/>
+        </w:numPr>
+        <w:spacing w:after="80" w:line="360"/>
+        <w:jc w:val="both"/>
+      </w:pPr>
+      <w:r>
+        <w:rPr>
+          <w:rFonts w:ascii="Times New Roman" w:cs="Times New Roman" w:eastAsia="Times New Roman" w:hAnsi="Times New Roman"/>
+          <w:sz w:val="24"/>
+          <w:szCs w:val="24"/>
+        </w:rPr>
+        <w:t xml:space="preserve">Remover das peças, antes de assinar, todas as marcações entre colchetes [CONFERIR ...] depois de feita cada conferência.</w:t>
       </w:r>
     </w:p>
     <w:p>

</xml_diff>

<commit_message>
ACP 0900193-90: v15 (final) — achados do crítico de completude aplicados: parecer da PGJ satisfeito, tela dos autos de origem, Termo JUCESC no rol, forma de assinatura da outorgante, alínea própria para a advogada original, reiteração da pauta; checklist com CNA e eventos posteriores
Co-Authored-By: Claude Fable 5.1 <noreply@anthropic.com>
Claude-Session: https://claude.ai/code/session_01CCVbA1mc4UdnaFNsukuTYT
</commit_message>
<xml_diff>
--- a/juridico/ACP-0900193-90.2016.8.24.0064/2026-09-02-cumprimento-ev25/auditoria/CHECKLIST-PROTOCOLO.docx
+++ b/juridico/ACP-0900193-90.2016.8.24.0064/2026-09-02-cumprimento-ev25/auditoria/CHECKLIST-PROTOCOLO.docx
@@ -233,7 +233,7 @@
           <w:sz w:val="24"/>
           <w:szCs w:val="24"/>
         </w:rPr>
-        <w:t xml:space="preserve">Grafia do nome: contrato social e CPF grafam "Fabrizio"; a OAB, "Fabrízio". A procuração registra as duas e informa a identidade; conferir a grafia do RG.</w:t>
+        <w:t xml:space="preserve">Grafia do nome: contrato social e CPF grafam "Fabrizio"; a OAB, "Fabrízio". A procuração registra as duas e informa a identidade; conferir a grafia do RG e a do Cadastro Nacional dos Advogados (CNA). Se o CNA grafar "Fabrizio", inverter nas três peças (grafia da OAB como principal), porque as publicações seguem a grafia da procuração ou do registro na OAB.</w:t>
       </w:r>
     </w:p>
     <w:p>
@@ -448,7 +448,25 @@
           <w:sz w:val="24"/>
           <w:szCs w:val="24"/>
         </w:rPr>
-        <w:t xml:space="preserve">: prazo "ABERTO", final 04/09/2026 23:59:59. 5. Protocolar pela ação </w:t>
+        <w:t xml:space="preserve">: prazo "ABERTO", final 04/09/2026 23:59:59. Ver também se há </w:t>
+      </w:r>
+      <w:r>
+        <w:rPr>
+          <w:rFonts w:ascii="Times New Roman" w:cs="Times New Roman" w:eastAsia="Times New Roman" w:hAnsi="Times New Roman"/>
+          <w:b/>
+          <w:bCs/>
+          <w:sz w:val="24"/>
+          <w:szCs w:val="24"/>
+        </w:rPr>
+        <w:t xml:space="preserve">eventos posteriores ao 32</w:t>
+      </w:r>
+      <w:r>
+        <w:rPr>
+          <w:rFonts w:ascii="Times New Roman" w:cs="Times New Roman" w:eastAsia="Times New Roman" w:hAnsi="Times New Roman"/>
+          <w:sz w:val="24"/>
+          <w:szCs w:val="24"/>
+        </w:rPr>
+        <w:t xml:space="preserve"> (juntada automática do pagamento, certidão da DCDP, manifestação da PGJ, novo despacho) e adaptar a peça se houver. 5. Protocolar pela ação </w:t>
       </w:r>
       <w:r>
         <w:rPr>

</xml_diff>